<commit_message>
remove CHECKING_OUT cart state because it is not used
</commit_message>
<xml_diff>
--- a/docs/final/dokumentace-projektu.docx
+++ b/docs/final/dokumentace-projektu.docx
@@ -3778,17 +3778,7 @@
           <w:sz w:val="22"/>
           <w:szCs w:val="22"/>
         </w:rPr>
-        <w:t xml:space="preserve">, </w:t>
-      </w:r>
-      <w:r>
-        <w:rPr>
-          <w:b/>
-          <w:bCs/>
-          <w:color w:val="auto"/>
-          <w:sz w:val="22"/>
-          <w:szCs w:val="22"/>
-        </w:rPr>
-        <w:t>User</w:t>
+        <w:t>, User</w:t>
       </w:r>
       <w:r>
         <w:rPr>
@@ -6240,7 +6230,7 @@
           <w:sz w:val="22"/>
           <w:szCs w:val="22"/>
         </w:rPr>
-        <w:t xml:space="preserve"> — EMPTY | ACTIVE | CHECKING_OUT</w:t>
+        <w:t xml:space="preserve"> — EMPTY | ACTIVE</w:t>
       </w:r>
     </w:p>
     <w:p>
@@ -6452,13 +6442,6 @@
           <w:szCs w:val="22"/>
         </w:rPr>
         <w:tab/>
-      </w:r>
-      <w:r>
-        <w:rPr>
-          <w:color w:val="222222"/>
-          <w:sz w:val="22"/>
-          <w:szCs w:val="22"/>
-        </w:rPr>
         <w:t>zákazník</w:t>
       </w:r>
       <w:r>
@@ -6480,6 +6463,34 @@
         <w:t>clear</w:t>
       </w:r>
       <w:proofErr w:type="spellEnd"/>
+    </w:p>
+    <w:p>
+      <w:pPr>
+        <w:pStyle w:val="Nadpis2"/>
+        <w:numPr>
+          <w:ilvl w:val="0"/>
+          <w:numId w:val="6"/>
+        </w:numPr>
+        <w:spacing w:before="80" w:after="0"/>
+        <w:jc w:val="left"/>
+        <w:rPr>
+          <w:b/>
+          <w:bCs/>
+          <w:color w:val="222222"/>
+          <w:sz w:val="22"/>
+          <w:szCs w:val="22"/>
+        </w:rPr>
+      </w:pPr>
+      <w:r>
+        <w:rPr>
+          <w:b/>
+          <w:bCs/>
+          <w:color w:val="222222"/>
+          <w:sz w:val="22"/>
+          <w:szCs w:val="22"/>
+        </w:rPr>
+        <w:t>Invarianty:</w:t>
+      </w:r>
     </w:p>
     <w:p>
       <w:pPr>
@@ -6502,61 +6513,25 @@
           <w:sz w:val="22"/>
           <w:szCs w:val="22"/>
         </w:rPr>
-        <w:t>ACTIVE → CHECKING_OUT</w:t>
-      </w:r>
-      <w:r>
-        <w:rPr>
-          <w:color w:val="222222"/>
-          <w:sz w:val="22"/>
-          <w:szCs w:val="22"/>
-        </w:rPr>
-        <w:tab/>
-        <w:t>zákazník</w:t>
-      </w:r>
-      <w:r>
-        <w:rPr>
-          <w:color w:val="222222"/>
-          <w:sz w:val="22"/>
-          <w:szCs w:val="22"/>
-        </w:rPr>
-        <w:tab/>
-        <w:t xml:space="preserve">vstup do </w:t>
-      </w:r>
-      <w:proofErr w:type="spellStart"/>
-      <w:r>
-        <w:rPr>
-          <w:color w:val="222222"/>
-          <w:sz w:val="22"/>
-          <w:szCs w:val="22"/>
-        </w:rPr>
-        <w:t>OrderView</w:t>
-      </w:r>
-      <w:proofErr w:type="spellEnd"/>
-      <w:r>
-        <w:rPr>
-          <w:color w:val="222222"/>
-          <w:sz w:val="22"/>
-          <w:szCs w:val="22"/>
-        </w:rPr>
-        <w:t xml:space="preserve"> (</w:t>
-      </w:r>
-      <w:proofErr w:type="spellStart"/>
-      <w:r>
-        <w:rPr>
-          <w:color w:val="222222"/>
-          <w:sz w:val="22"/>
-          <w:szCs w:val="22"/>
-        </w:rPr>
-        <w:t>checkout</w:t>
-      </w:r>
-      <w:proofErr w:type="spellEnd"/>
-      <w:r>
-        <w:rPr>
-          <w:color w:val="222222"/>
-          <w:sz w:val="22"/>
-          <w:szCs w:val="22"/>
-        </w:rPr>
-        <w:t>)</w:t>
+        <w:t xml:space="preserve">Množství u každé </w:t>
+      </w:r>
+      <w:proofErr w:type="gramStart"/>
+      <w:r>
+        <w:rPr>
+          <w:color w:val="222222"/>
+          <w:sz w:val="22"/>
+          <w:szCs w:val="22"/>
+        </w:rPr>
+        <w:t>položky &gt;</w:t>
+      </w:r>
+      <w:proofErr w:type="gramEnd"/>
+      <w:r>
+        <w:rPr>
+          <w:color w:val="222222"/>
+          <w:sz w:val="22"/>
+          <w:szCs w:val="22"/>
+        </w:rPr>
+        <w:t xml:space="preserve"> 0 (hodnota 0 → REMOVE_ITEM).</w:t>
       </w:r>
     </w:p>
     <w:p>
@@ -6580,40 +6555,7 @@
           <w:sz w:val="22"/>
           <w:szCs w:val="22"/>
         </w:rPr>
-        <w:t>CHECKING_OUT → EMPTY</w:t>
-      </w:r>
-      <w:r>
-        <w:rPr>
-          <w:color w:val="222222"/>
-          <w:sz w:val="22"/>
-          <w:szCs w:val="22"/>
-        </w:rPr>
-        <w:tab/>
-        <w:t>systém</w:t>
-      </w:r>
-      <w:r>
-        <w:rPr>
-          <w:color w:val="222222"/>
-          <w:sz w:val="22"/>
-          <w:szCs w:val="22"/>
-        </w:rPr>
-        <w:tab/>
-      </w:r>
-      <w:r>
-        <w:rPr>
-          <w:color w:val="222222"/>
-          <w:sz w:val="22"/>
-          <w:szCs w:val="22"/>
-        </w:rPr>
-        <w:tab/>
-      </w:r>
-      <w:r>
-        <w:rPr>
-          <w:color w:val="222222"/>
-          <w:sz w:val="22"/>
-          <w:szCs w:val="22"/>
-        </w:rPr>
-        <w:t>objednávka úspěšně vytvořena</w:t>
+        <w:t>S košíkem smí pracovat pouze přihlášený uživatel.</w:t>
       </w:r>
     </w:p>
     <w:p>
@@ -6637,160 +6579,6 @@
           <w:sz w:val="22"/>
           <w:szCs w:val="22"/>
         </w:rPr>
-        <w:t>CHECKING_OUT → ACTIVE</w:t>
-      </w:r>
-      <w:r>
-        <w:rPr>
-          <w:color w:val="222222"/>
-          <w:sz w:val="22"/>
-          <w:szCs w:val="22"/>
-        </w:rPr>
-        <w:tab/>
-        <w:t>zákazník</w:t>
-      </w:r>
-      <w:r>
-        <w:rPr>
-          <w:color w:val="222222"/>
-          <w:sz w:val="22"/>
-          <w:szCs w:val="22"/>
-        </w:rPr>
-        <w:tab/>
-        <w:t xml:space="preserve">návrat z </w:t>
-      </w:r>
-      <w:proofErr w:type="spellStart"/>
-      <w:r>
-        <w:rPr>
-          <w:color w:val="222222"/>
-          <w:sz w:val="22"/>
-          <w:szCs w:val="22"/>
-        </w:rPr>
-        <w:t>checkoutu</w:t>
-      </w:r>
-      <w:proofErr w:type="spellEnd"/>
-      <w:r>
-        <w:rPr>
-          <w:color w:val="222222"/>
-          <w:sz w:val="22"/>
-          <w:szCs w:val="22"/>
-        </w:rPr>
-        <w:t xml:space="preserve"> zpět do košíku</w:t>
-      </w:r>
-    </w:p>
-    <w:p>
-      <w:pPr>
-        <w:pStyle w:val="Nadpis2"/>
-        <w:numPr>
-          <w:ilvl w:val="0"/>
-          <w:numId w:val="6"/>
-        </w:numPr>
-        <w:spacing w:before="80" w:after="0"/>
-        <w:jc w:val="left"/>
-        <w:rPr>
-          <w:b/>
-          <w:bCs/>
-          <w:color w:val="222222"/>
-          <w:sz w:val="22"/>
-          <w:szCs w:val="22"/>
-        </w:rPr>
-      </w:pPr>
-      <w:r>
-        <w:rPr>
-          <w:b/>
-          <w:bCs/>
-          <w:color w:val="222222"/>
-          <w:sz w:val="22"/>
-          <w:szCs w:val="22"/>
-        </w:rPr>
-        <w:t>Invarianty:</w:t>
-      </w:r>
-    </w:p>
-    <w:p>
-      <w:pPr>
-        <w:pStyle w:val="Nadpis2"/>
-        <w:numPr>
-          <w:ilvl w:val="1"/>
-          <w:numId w:val="6"/>
-        </w:numPr>
-        <w:spacing w:before="80" w:after="0"/>
-        <w:jc w:val="left"/>
-        <w:rPr>
-          <w:color w:val="222222"/>
-          <w:sz w:val="22"/>
-          <w:szCs w:val="22"/>
-        </w:rPr>
-      </w:pPr>
-      <w:r>
-        <w:rPr>
-          <w:color w:val="222222"/>
-          <w:sz w:val="22"/>
-          <w:szCs w:val="22"/>
-        </w:rPr>
-        <w:t xml:space="preserve">Množství u každé </w:t>
-      </w:r>
-      <w:proofErr w:type="gramStart"/>
-      <w:r>
-        <w:rPr>
-          <w:color w:val="222222"/>
-          <w:sz w:val="22"/>
-          <w:szCs w:val="22"/>
-        </w:rPr>
-        <w:t>položky &gt;</w:t>
-      </w:r>
-      <w:proofErr w:type="gramEnd"/>
-      <w:r>
-        <w:rPr>
-          <w:color w:val="222222"/>
-          <w:sz w:val="22"/>
-          <w:szCs w:val="22"/>
-        </w:rPr>
-        <w:t xml:space="preserve"> 0 (hodnota 0 → REMOVE_ITEM).</w:t>
-      </w:r>
-    </w:p>
-    <w:p>
-      <w:pPr>
-        <w:pStyle w:val="Nadpis2"/>
-        <w:numPr>
-          <w:ilvl w:val="1"/>
-          <w:numId w:val="6"/>
-        </w:numPr>
-        <w:spacing w:before="80" w:after="0"/>
-        <w:jc w:val="left"/>
-        <w:rPr>
-          <w:color w:val="222222"/>
-          <w:sz w:val="22"/>
-          <w:szCs w:val="22"/>
-        </w:rPr>
-      </w:pPr>
-      <w:r>
-        <w:rPr>
-          <w:color w:val="222222"/>
-          <w:sz w:val="22"/>
-          <w:szCs w:val="22"/>
-        </w:rPr>
-        <w:t>S košíkem smí pracovat pouze přihlášený uživatel.</w:t>
-      </w:r>
-    </w:p>
-    <w:p>
-      <w:pPr>
-        <w:pStyle w:val="Nadpis2"/>
-        <w:numPr>
-          <w:ilvl w:val="1"/>
-          <w:numId w:val="6"/>
-        </w:numPr>
-        <w:spacing w:before="80" w:after="0"/>
-        <w:jc w:val="left"/>
-        <w:rPr>
-          <w:color w:val="222222"/>
-          <w:sz w:val="22"/>
-          <w:szCs w:val="22"/>
-        </w:rPr>
-      </w:pPr>
-      <w:r>
-        <w:rPr>
-          <w:color w:val="222222"/>
-          <w:sz w:val="22"/>
-          <w:szCs w:val="22"/>
-        </w:rPr>
         <w:t>Při odhlášení je košík resetován na EMPTY.</w:t>
       </w:r>
     </w:p>
@@ -6922,15 +6710,7 @@
           <w:sz w:val="22"/>
           <w:szCs w:val="22"/>
         </w:rPr>
-        <w:t>Role</w:t>
-      </w:r>
-      <w:r>
-        <w:rPr>
-          <w:color w:val="222222"/>
-          <w:sz w:val="22"/>
-          <w:szCs w:val="22"/>
-        </w:rPr>
-        <w:t xml:space="preserve"> </w:t>
+        <w:t xml:space="preserve">Role </w:t>
       </w:r>
       <w:r>
         <w:rPr>
@@ -7064,15 +6844,7 @@
           <w:sz w:val="22"/>
           <w:szCs w:val="22"/>
         </w:rPr>
-        <w:t>Role</w:t>
-      </w:r>
-      <w:r>
-        <w:rPr>
-          <w:color w:val="222222"/>
-          <w:sz w:val="22"/>
-          <w:szCs w:val="22"/>
-        </w:rPr>
-        <w:t xml:space="preserve"> </w:t>
+        <w:t xml:space="preserve">Role </w:t>
       </w:r>
       <w:r>
         <w:rPr>
@@ -7206,16 +6978,7 @@
           <w:sz w:val="22"/>
           <w:szCs w:val="22"/>
         </w:rPr>
-        <w:lastRenderedPageBreak/>
-        <w:t>Role</w:t>
-      </w:r>
-      <w:r>
-        <w:rPr>
-          <w:color w:val="222222"/>
-          <w:sz w:val="22"/>
-          <w:szCs w:val="22"/>
-        </w:rPr>
-        <w:t xml:space="preserve"> </w:t>
+        <w:t xml:space="preserve">Role </w:t>
       </w:r>
       <w:r>
         <w:rPr>
@@ -7327,15 +7090,7 @@
           <w:sz w:val="22"/>
           <w:szCs w:val="22"/>
         </w:rPr>
-        <w:t xml:space="preserve"> </w:t>
-      </w:r>
-      <w:r>
-        <w:rPr>
-          <w:color w:val="222222"/>
-          <w:sz w:val="22"/>
-          <w:szCs w:val="22"/>
-        </w:rPr>
-        <w:t xml:space="preserve">Nesmí: </w:t>
+        <w:t xml:space="preserve"> Nesmí: </w:t>
       </w:r>
       <w:r>
         <w:rPr>
@@ -7367,6 +7122,7 @@
           <w:sz w:val="22"/>
           <w:szCs w:val="22"/>
         </w:rPr>
+        <w:lastRenderedPageBreak/>
         <w:t>Kde je pravidlo vynuceno a proč</w:t>
       </w:r>
     </w:p>
@@ -9488,7 +9244,6 @@
           <w:sz w:val="22"/>
           <w:szCs w:val="22"/>
         </w:rPr>
-        <w:lastRenderedPageBreak/>
         <w:t xml:space="preserve">Student: </w:t>
       </w:r>
       <w:r>
@@ -9668,7 +9423,16 @@
           <w:sz w:val="22"/>
           <w:szCs w:val="22"/>
         </w:rPr>
-        <w:t xml:space="preserve">() mapuje kontext na navigační akci (ENTER_*_VIEW). Kompozice </w:t>
+        <w:t xml:space="preserve">() </w:t>
+      </w:r>
+      <w:r>
+        <w:rPr>
+          <w:color w:val="222222"/>
+          <w:sz w:val="22"/>
+          <w:szCs w:val="22"/>
+        </w:rPr>
+        <w:lastRenderedPageBreak/>
+        <w:t xml:space="preserve">mapuje kontext na navigační akci (ENTER_*_VIEW). Kompozice </w:t>
       </w:r>
       <w:proofErr w:type="spellStart"/>
       <w:proofErr w:type="gramStart"/>
@@ -12054,7 +11818,6 @@
           <w:sz w:val="22"/>
           <w:szCs w:val="22"/>
         </w:rPr>
-        <w:lastRenderedPageBreak/>
         <w:t>shop.cart</w:t>
       </w:r>
       <w:proofErr w:type="spellEnd"/>
@@ -12135,17 +11898,7 @@
           <w:sz w:val="22"/>
           <w:szCs w:val="22"/>
         </w:rPr>
-        <w:t>počátečního stavu (před APP_INIT)</w:t>
-      </w:r>
-      <w:r>
-        <w:rPr>
-          <w:b/>
-          <w:bCs/>
-          <w:color w:val="222222"/>
-          <w:sz w:val="22"/>
-          <w:szCs w:val="22"/>
-        </w:rPr>
-        <w:t>:</w:t>
+        <w:t>počátečního stavu (před APP_INIT):</w:t>
       </w:r>
     </w:p>
     <w:p>
@@ -12197,6 +11950,7 @@
           <w:sz w:val="22"/>
           <w:szCs w:val="22"/>
         </w:rPr>
+        <w:lastRenderedPageBreak/>
         <w:t xml:space="preserve">  </w:t>
       </w:r>
       <w:proofErr w:type="spellStart"/>
@@ -13911,7 +13665,6 @@
           <w:sz w:val="22"/>
           <w:szCs w:val="22"/>
         </w:rPr>
-        <w:lastRenderedPageBreak/>
         <w:t xml:space="preserve">Záměr: </w:t>
       </w:r>
       <w:r>
@@ -14110,6 +13863,7 @@
           <w:sz w:val="22"/>
           <w:szCs w:val="22"/>
         </w:rPr>
+        <w:lastRenderedPageBreak/>
         <w:t>ENTER_ORDER_VIEW</w:t>
       </w:r>
       <w:r>
@@ -15159,17 +14913,7 @@
           <w:sz w:val="22"/>
           <w:szCs w:val="22"/>
         </w:rPr>
-        <w:t>)</w:t>
-      </w:r>
-      <w:r>
-        <w:rPr>
-          <w:b/>
-          <w:bCs/>
-          <w:color w:val="222222"/>
-          <w:sz w:val="22"/>
-          <w:szCs w:val="22"/>
-        </w:rPr>
-        <w:t>:</w:t>
+        <w:t>):</w:t>
       </w:r>
     </w:p>
     <w:p>
@@ -15500,7 +15244,6 @@
           <w:sz w:val="22"/>
           <w:szCs w:val="22"/>
         </w:rPr>
-        <w:lastRenderedPageBreak/>
         <w:t>CART_UPDATE_ITEM</w:t>
       </w:r>
       <w:r>
@@ -15698,6 +15441,7 @@
           <w:sz w:val="22"/>
           <w:szCs w:val="22"/>
         </w:rPr>
+        <w:lastRenderedPageBreak/>
         <w:t>Payload</w:t>
       </w:r>
       <w:proofErr w:type="spellEnd"/>
@@ -15803,17 +15547,7 @@
           <w:sz w:val="22"/>
           <w:szCs w:val="22"/>
         </w:rPr>
-        <w:t>)</w:t>
-      </w:r>
-      <w:r>
-        <w:rPr>
-          <w:b/>
-          <w:bCs/>
-          <w:color w:val="222222"/>
-          <w:sz w:val="22"/>
-          <w:szCs w:val="22"/>
-        </w:rPr>
-        <w:t>:</w:t>
+        <w:t>):</w:t>
       </w:r>
     </w:p>
     <w:p>
@@ -16724,17 +16458,7 @@
           <w:sz w:val="22"/>
           <w:szCs w:val="22"/>
         </w:rPr>
-        <w:t>Záměr</w:t>
-      </w:r>
-      <w:r>
-        <w:rPr>
-          <w:b/>
-          <w:bCs/>
-          <w:color w:val="222222"/>
-          <w:sz w:val="22"/>
-          <w:szCs w:val="22"/>
-        </w:rPr>
-        <w:t xml:space="preserve">: </w:t>
+        <w:t xml:space="preserve">Záměr: </w:t>
       </w:r>
       <w:r>
         <w:rPr>
@@ -17130,7 +16854,6 @@
           <w:sz w:val="22"/>
           <w:szCs w:val="22"/>
         </w:rPr>
-        <w:lastRenderedPageBreak/>
         <w:t xml:space="preserve">case </w:t>
       </w:r>
       <w:proofErr w:type="spellStart"/>
@@ -17430,6 +17153,7 @@
           <w:sz w:val="22"/>
           <w:szCs w:val="22"/>
         </w:rPr>
+        <w:lastRenderedPageBreak/>
         <w:t>Kontext</w:t>
       </w:r>
       <w:r>
@@ -18984,7 +18708,6 @@
           <w:sz w:val="22"/>
           <w:szCs w:val="22"/>
         </w:rPr>
-        <w:lastRenderedPageBreak/>
         <w:t>Popište přehled selektorů</w:t>
       </w:r>
       <w:r>
@@ -21245,7 +20968,6 @@
           <w:sz w:val="22"/>
           <w:szCs w:val="22"/>
         </w:rPr>
-        <w:lastRenderedPageBreak/>
         <w:t>Buď z argumentů (</w:t>
       </w:r>
       <w:proofErr w:type="spellStart"/>
@@ -21589,6 +21311,7 @@
           <w:sz w:val="22"/>
           <w:szCs w:val="22"/>
         </w:rPr>
+        <w:lastRenderedPageBreak/>
         <w:t>capabilities</w:t>
       </w:r>
       <w:proofErr w:type="spellEnd"/>
@@ -23459,390 +23182,390 @@
         <w:jc w:val="left"/>
       </w:pPr>
       <w:r>
+        <w:t>10. Testovací scénáře</w:t>
+      </w:r>
+    </w:p>
+    <w:p>
+      <w:pPr>
+        <w:pStyle w:val="Nadpis2"/>
+        <w:spacing w:before="80" w:after="0"/>
+        <w:jc w:val="left"/>
+        <w:rPr>
+          <w:color w:val="222222"/>
+          <w:sz w:val="22"/>
+          <w:szCs w:val="22"/>
+        </w:rPr>
+      </w:pPr>
+      <w:r>
+        <w:rPr>
+          <w:color w:val="222222"/>
+          <w:sz w:val="22"/>
+          <w:szCs w:val="22"/>
+        </w:rPr>
+        <w:t xml:space="preserve">Testy jsou psané v čistém Node.js ESM bez test </w:t>
+      </w:r>
+      <w:proofErr w:type="spellStart"/>
+      <w:r>
+        <w:rPr>
+          <w:color w:val="222222"/>
+          <w:sz w:val="22"/>
+          <w:szCs w:val="22"/>
+        </w:rPr>
+        <w:t>runneru</w:t>
+      </w:r>
+      <w:proofErr w:type="spellEnd"/>
+      <w:r>
+        <w:rPr>
+          <w:color w:val="222222"/>
+          <w:sz w:val="22"/>
+          <w:szCs w:val="22"/>
+        </w:rPr>
+        <w:t>. Vstupní bod:</w:t>
+      </w:r>
+      <w:r>
+        <w:rPr>
+          <w:b/>
+          <w:bCs/>
+          <w:color w:val="222222"/>
+          <w:sz w:val="22"/>
+          <w:szCs w:val="22"/>
+        </w:rPr>
+        <w:t xml:space="preserve"> </w:t>
+      </w:r>
+      <w:proofErr w:type="spellStart"/>
+      <w:r>
+        <w:rPr>
+          <w:b/>
+          <w:bCs/>
+          <w:color w:val="222222"/>
+          <w:sz w:val="22"/>
+          <w:szCs w:val="22"/>
+        </w:rPr>
+        <w:t>tests</w:t>
+      </w:r>
+      <w:proofErr w:type="spellEnd"/>
+      <w:r>
+        <w:rPr>
+          <w:b/>
+          <w:bCs/>
+          <w:color w:val="222222"/>
+          <w:sz w:val="22"/>
+          <w:szCs w:val="22"/>
+        </w:rPr>
+        <w:t>/</w:t>
+      </w:r>
+      <w:proofErr w:type="spellStart"/>
+      <w:r>
+        <w:rPr>
+          <w:b/>
+          <w:bCs/>
+          <w:color w:val="222222"/>
+          <w:sz w:val="22"/>
+          <w:szCs w:val="22"/>
+        </w:rPr>
+        <w:t>runAllTests.test.mjs</w:t>
+      </w:r>
+      <w:proofErr w:type="spellEnd"/>
+      <w:r>
+        <w:rPr>
+          <w:color w:val="222222"/>
+          <w:sz w:val="22"/>
+          <w:szCs w:val="22"/>
+        </w:rPr>
+        <w:t xml:space="preserve"> (importuje všechny sady). Framework je v </w:t>
+      </w:r>
+      <w:proofErr w:type="spellStart"/>
+      <w:r>
+        <w:rPr>
+          <w:color w:val="222222"/>
+          <w:sz w:val="22"/>
+          <w:szCs w:val="22"/>
+        </w:rPr>
+        <w:t>tests</w:t>
+      </w:r>
+      <w:proofErr w:type="spellEnd"/>
+      <w:r>
+        <w:rPr>
+          <w:color w:val="222222"/>
+          <w:sz w:val="22"/>
+          <w:szCs w:val="22"/>
+        </w:rPr>
+        <w:t>/</w:t>
+      </w:r>
+      <w:proofErr w:type="spellStart"/>
+      <w:r>
+        <w:rPr>
+          <w:color w:val="222222"/>
+          <w:sz w:val="22"/>
+          <w:szCs w:val="22"/>
+        </w:rPr>
+        <w:t>testFramework.mjs</w:t>
+      </w:r>
+      <w:proofErr w:type="spellEnd"/>
+      <w:r>
+        <w:rPr>
+          <w:color w:val="222222"/>
+          <w:sz w:val="22"/>
+          <w:szCs w:val="22"/>
+        </w:rPr>
+        <w:t xml:space="preserve"> a nabízí </w:t>
+      </w:r>
+      <w:proofErr w:type="spellStart"/>
+      <w:proofErr w:type="gramStart"/>
+      <w:r>
+        <w:rPr>
+          <w:color w:val="222222"/>
+          <w:sz w:val="22"/>
+          <w:szCs w:val="22"/>
+        </w:rPr>
+        <w:t>asyncTest</w:t>
+      </w:r>
+      <w:proofErr w:type="spellEnd"/>
+      <w:r>
+        <w:rPr>
+          <w:color w:val="222222"/>
+          <w:sz w:val="22"/>
+          <w:szCs w:val="22"/>
+        </w:rPr>
+        <w:t>(</w:t>
+      </w:r>
+      <w:proofErr w:type="spellStart"/>
+      <w:proofErr w:type="gramEnd"/>
+      <w:r>
+        <w:rPr>
+          <w:color w:val="222222"/>
+          <w:sz w:val="22"/>
+          <w:szCs w:val="22"/>
+        </w:rPr>
+        <w:t>name</w:t>
+      </w:r>
+      <w:proofErr w:type="spellEnd"/>
+      <w:r>
+        <w:rPr>
+          <w:color w:val="222222"/>
+          <w:sz w:val="22"/>
+          <w:szCs w:val="22"/>
+        </w:rPr>
+        <w:t xml:space="preserve">, </w:t>
+      </w:r>
+      <w:proofErr w:type="spellStart"/>
+      <w:r>
+        <w:rPr>
+          <w:color w:val="222222"/>
+          <w:sz w:val="22"/>
+          <w:szCs w:val="22"/>
+        </w:rPr>
+        <w:t>fn</w:t>
+      </w:r>
+      <w:proofErr w:type="spellEnd"/>
+      <w:r>
+        <w:rPr>
+          <w:color w:val="222222"/>
+          <w:sz w:val="22"/>
+          <w:szCs w:val="22"/>
+        </w:rPr>
+        <w:t xml:space="preserve">), </w:t>
+      </w:r>
+      <w:proofErr w:type="spellStart"/>
+      <w:r>
+        <w:rPr>
+          <w:color w:val="222222"/>
+          <w:sz w:val="22"/>
+          <w:szCs w:val="22"/>
+        </w:rPr>
+        <w:t>asertace</w:t>
+      </w:r>
+      <w:proofErr w:type="spellEnd"/>
+      <w:r>
+        <w:rPr>
+          <w:color w:val="222222"/>
+          <w:sz w:val="22"/>
+          <w:szCs w:val="22"/>
+        </w:rPr>
+        <w:t xml:space="preserve"> a sumář (</w:t>
+      </w:r>
+      <w:proofErr w:type="spellStart"/>
+      <w:r>
+        <w:rPr>
+          <w:color w:val="222222"/>
+          <w:sz w:val="22"/>
+          <w:szCs w:val="22"/>
+        </w:rPr>
+        <w:t>printSummary</w:t>
+      </w:r>
+      <w:proofErr w:type="spellEnd"/>
+      <w:r>
+        <w:rPr>
+          <w:color w:val="222222"/>
+          <w:sz w:val="22"/>
+          <w:szCs w:val="22"/>
+        </w:rPr>
+        <w:t>()).</w:t>
+      </w:r>
+    </w:p>
+    <w:p>
+      <w:pPr>
+        <w:pStyle w:val="Nadpis2"/>
+        <w:spacing w:before="80" w:after="0"/>
+        <w:jc w:val="left"/>
+        <w:rPr>
+          <w:color w:val="222222"/>
+          <w:sz w:val="22"/>
+          <w:szCs w:val="22"/>
+        </w:rPr>
+      </w:pPr>
+    </w:p>
+    <w:p>
+      <w:pPr>
+        <w:pStyle w:val="Nadpis2"/>
+        <w:spacing w:before="80" w:after="0"/>
+        <w:jc w:val="left"/>
+        <w:rPr>
+          <w:color w:val="222222"/>
+          <w:sz w:val="22"/>
+          <w:szCs w:val="22"/>
+        </w:rPr>
+      </w:pPr>
+      <w:r>
+        <w:rPr>
+          <w:b/>
+          <w:bCs/>
+          <w:color w:val="222222"/>
+          <w:sz w:val="22"/>
+          <w:szCs w:val="22"/>
+        </w:rPr>
+        <w:t>Spuštění</w:t>
+      </w:r>
+      <w:r>
+        <w:rPr>
+          <w:b/>
+          <w:bCs/>
+          <w:color w:val="222222"/>
+          <w:sz w:val="22"/>
+          <w:szCs w:val="22"/>
+        </w:rPr>
+        <w:t xml:space="preserve"> -</w:t>
+      </w:r>
+      <w:r>
+        <w:rPr>
+          <w:b/>
+          <w:bCs/>
+          <w:color w:val="222222"/>
+          <w:sz w:val="22"/>
+          <w:szCs w:val="22"/>
+          <w:lang w:val="en-US"/>
+        </w:rPr>
+        <w:t xml:space="preserve">&gt; </w:t>
+      </w:r>
+      <w:r>
+        <w:rPr>
+          <w:color w:val="222222"/>
+          <w:sz w:val="22"/>
+          <w:szCs w:val="22"/>
+        </w:rPr>
+        <w:t>příkazem z </w:t>
+      </w:r>
+      <w:proofErr w:type="spellStart"/>
+      <w:r>
+        <w:rPr>
+          <w:color w:val="222222"/>
+          <w:sz w:val="22"/>
+          <w:szCs w:val="22"/>
+        </w:rPr>
+        <w:t>rootu</w:t>
+      </w:r>
+      <w:proofErr w:type="spellEnd"/>
+      <w:r>
+        <w:rPr>
+          <w:color w:val="222222"/>
+          <w:sz w:val="22"/>
+          <w:szCs w:val="22"/>
+        </w:rPr>
+        <w:t xml:space="preserve"> projektu:</w:t>
+      </w:r>
+      <w:r>
+        <w:rPr>
+          <w:b/>
+          <w:bCs/>
+          <w:color w:val="222222"/>
+          <w:sz w:val="22"/>
+          <w:szCs w:val="22"/>
+        </w:rPr>
+        <w:t xml:space="preserve"> </w:t>
+      </w:r>
+      <w:r>
+        <w:rPr>
+          <w:b/>
+          <w:bCs/>
+          <w:color w:val="222222"/>
+          <w:sz w:val="22"/>
+          <w:szCs w:val="22"/>
+        </w:rPr>
+        <w:t xml:space="preserve">node </w:t>
+      </w:r>
+      <w:r>
+        <w:rPr>
+          <w:b/>
+          <w:bCs/>
+          <w:color w:val="222222"/>
+          <w:sz w:val="22"/>
+          <w:szCs w:val="22"/>
+        </w:rPr>
+        <w:t>./</w:t>
+      </w:r>
+      <w:proofErr w:type="spellStart"/>
+      <w:r>
+        <w:rPr>
+          <w:b/>
+          <w:bCs/>
+          <w:color w:val="222222"/>
+          <w:sz w:val="22"/>
+          <w:szCs w:val="22"/>
+        </w:rPr>
+        <w:t>tests</w:t>
+      </w:r>
+      <w:proofErr w:type="spellEnd"/>
+      <w:r>
+        <w:rPr>
+          <w:b/>
+          <w:bCs/>
+          <w:color w:val="222222"/>
+          <w:sz w:val="22"/>
+          <w:szCs w:val="22"/>
+        </w:rPr>
+        <w:t>/</w:t>
+      </w:r>
+      <w:proofErr w:type="spellStart"/>
+      <w:r>
+        <w:rPr>
+          <w:b/>
+          <w:bCs/>
+          <w:color w:val="222222"/>
+          <w:sz w:val="22"/>
+          <w:szCs w:val="22"/>
+        </w:rPr>
+        <w:t>runAllTests.test.mjs</w:t>
+      </w:r>
+      <w:proofErr w:type="spellEnd"/>
+    </w:p>
+    <w:p>
+      <w:pPr>
+        <w:pStyle w:val="Nadpis2"/>
+        <w:spacing w:before="80" w:after="0"/>
+        <w:jc w:val="left"/>
+        <w:rPr>
+          <w:color w:val="222222"/>
+          <w:sz w:val="22"/>
+          <w:szCs w:val="22"/>
+        </w:rPr>
+      </w:pPr>
+      <w:r>
+        <w:rPr>
+          <w:color w:val="222222"/>
+          <w:sz w:val="22"/>
+          <w:szCs w:val="22"/>
+        </w:rPr>
         <w:lastRenderedPageBreak/>
-        <w:t>10. Testovací scénáře</w:t>
-      </w:r>
-    </w:p>
-    <w:p>
-      <w:pPr>
-        <w:pStyle w:val="Nadpis2"/>
-        <w:spacing w:before="80" w:after="0"/>
-        <w:jc w:val="left"/>
-        <w:rPr>
-          <w:color w:val="222222"/>
-          <w:sz w:val="22"/>
-          <w:szCs w:val="22"/>
-        </w:rPr>
-      </w:pPr>
-      <w:r>
-        <w:rPr>
-          <w:color w:val="222222"/>
-          <w:sz w:val="22"/>
-          <w:szCs w:val="22"/>
-        </w:rPr>
-        <w:t xml:space="preserve">Testy jsou psané v čistém Node.js ESM bez test </w:t>
-      </w:r>
-      <w:proofErr w:type="spellStart"/>
-      <w:r>
-        <w:rPr>
-          <w:color w:val="222222"/>
-          <w:sz w:val="22"/>
-          <w:szCs w:val="22"/>
-        </w:rPr>
-        <w:t>runneru</w:t>
-      </w:r>
-      <w:proofErr w:type="spellEnd"/>
-      <w:r>
-        <w:rPr>
-          <w:color w:val="222222"/>
-          <w:sz w:val="22"/>
-          <w:szCs w:val="22"/>
-        </w:rPr>
-        <w:t>. Vstupní bod:</w:t>
-      </w:r>
-      <w:r>
-        <w:rPr>
-          <w:b/>
-          <w:bCs/>
-          <w:color w:val="222222"/>
-          <w:sz w:val="22"/>
-          <w:szCs w:val="22"/>
-        </w:rPr>
-        <w:t xml:space="preserve"> </w:t>
-      </w:r>
-      <w:proofErr w:type="spellStart"/>
-      <w:r>
-        <w:rPr>
-          <w:b/>
-          <w:bCs/>
-          <w:color w:val="222222"/>
-          <w:sz w:val="22"/>
-          <w:szCs w:val="22"/>
-        </w:rPr>
-        <w:t>tests</w:t>
-      </w:r>
-      <w:proofErr w:type="spellEnd"/>
-      <w:r>
-        <w:rPr>
-          <w:b/>
-          <w:bCs/>
-          <w:color w:val="222222"/>
-          <w:sz w:val="22"/>
-          <w:szCs w:val="22"/>
-        </w:rPr>
-        <w:t>/</w:t>
-      </w:r>
-      <w:proofErr w:type="spellStart"/>
-      <w:r>
-        <w:rPr>
-          <w:b/>
-          <w:bCs/>
-          <w:color w:val="222222"/>
-          <w:sz w:val="22"/>
-          <w:szCs w:val="22"/>
-        </w:rPr>
-        <w:t>runAllTests.test.mjs</w:t>
-      </w:r>
-      <w:proofErr w:type="spellEnd"/>
-      <w:r>
-        <w:rPr>
-          <w:color w:val="222222"/>
-          <w:sz w:val="22"/>
-          <w:szCs w:val="22"/>
-        </w:rPr>
-        <w:t xml:space="preserve"> (importuje všechny sady). Framework je v </w:t>
-      </w:r>
-      <w:proofErr w:type="spellStart"/>
-      <w:r>
-        <w:rPr>
-          <w:color w:val="222222"/>
-          <w:sz w:val="22"/>
-          <w:szCs w:val="22"/>
-        </w:rPr>
-        <w:t>tests</w:t>
-      </w:r>
-      <w:proofErr w:type="spellEnd"/>
-      <w:r>
-        <w:rPr>
-          <w:color w:val="222222"/>
-          <w:sz w:val="22"/>
-          <w:szCs w:val="22"/>
-        </w:rPr>
-        <w:t>/</w:t>
-      </w:r>
-      <w:proofErr w:type="spellStart"/>
-      <w:r>
-        <w:rPr>
-          <w:color w:val="222222"/>
-          <w:sz w:val="22"/>
-          <w:szCs w:val="22"/>
-        </w:rPr>
-        <w:t>testFramework.mjs</w:t>
-      </w:r>
-      <w:proofErr w:type="spellEnd"/>
-      <w:r>
-        <w:rPr>
-          <w:color w:val="222222"/>
-          <w:sz w:val="22"/>
-          <w:szCs w:val="22"/>
-        </w:rPr>
-        <w:t xml:space="preserve"> a nabízí </w:t>
-      </w:r>
-      <w:proofErr w:type="spellStart"/>
-      <w:proofErr w:type="gramStart"/>
-      <w:r>
-        <w:rPr>
-          <w:color w:val="222222"/>
-          <w:sz w:val="22"/>
-          <w:szCs w:val="22"/>
-        </w:rPr>
-        <w:t>asyncTest</w:t>
-      </w:r>
-      <w:proofErr w:type="spellEnd"/>
-      <w:r>
-        <w:rPr>
-          <w:color w:val="222222"/>
-          <w:sz w:val="22"/>
-          <w:szCs w:val="22"/>
-        </w:rPr>
-        <w:t>(</w:t>
-      </w:r>
-      <w:proofErr w:type="spellStart"/>
-      <w:proofErr w:type="gramEnd"/>
-      <w:r>
-        <w:rPr>
-          <w:color w:val="222222"/>
-          <w:sz w:val="22"/>
-          <w:szCs w:val="22"/>
-        </w:rPr>
-        <w:t>name</w:t>
-      </w:r>
-      <w:proofErr w:type="spellEnd"/>
-      <w:r>
-        <w:rPr>
-          <w:color w:val="222222"/>
-          <w:sz w:val="22"/>
-          <w:szCs w:val="22"/>
-        </w:rPr>
-        <w:t xml:space="preserve">, </w:t>
-      </w:r>
-      <w:proofErr w:type="spellStart"/>
-      <w:r>
-        <w:rPr>
-          <w:color w:val="222222"/>
-          <w:sz w:val="22"/>
-          <w:szCs w:val="22"/>
-        </w:rPr>
-        <w:t>fn</w:t>
-      </w:r>
-      <w:proofErr w:type="spellEnd"/>
-      <w:r>
-        <w:rPr>
-          <w:color w:val="222222"/>
-          <w:sz w:val="22"/>
-          <w:szCs w:val="22"/>
-        </w:rPr>
-        <w:t xml:space="preserve">), </w:t>
-      </w:r>
-      <w:proofErr w:type="spellStart"/>
-      <w:r>
-        <w:rPr>
-          <w:color w:val="222222"/>
-          <w:sz w:val="22"/>
-          <w:szCs w:val="22"/>
-        </w:rPr>
-        <w:t>asertace</w:t>
-      </w:r>
-      <w:proofErr w:type="spellEnd"/>
-      <w:r>
-        <w:rPr>
-          <w:color w:val="222222"/>
-          <w:sz w:val="22"/>
-          <w:szCs w:val="22"/>
-        </w:rPr>
-        <w:t xml:space="preserve"> a sumář (</w:t>
-      </w:r>
-      <w:proofErr w:type="spellStart"/>
-      <w:r>
-        <w:rPr>
-          <w:color w:val="222222"/>
-          <w:sz w:val="22"/>
-          <w:szCs w:val="22"/>
-        </w:rPr>
-        <w:t>printSummary</w:t>
-      </w:r>
-      <w:proofErr w:type="spellEnd"/>
-      <w:r>
-        <w:rPr>
-          <w:color w:val="222222"/>
-          <w:sz w:val="22"/>
-          <w:szCs w:val="22"/>
-        </w:rPr>
-        <w:t>()).</w:t>
-      </w:r>
-    </w:p>
-    <w:p>
-      <w:pPr>
-        <w:pStyle w:val="Nadpis2"/>
-        <w:spacing w:before="80" w:after="0"/>
-        <w:jc w:val="left"/>
-        <w:rPr>
-          <w:color w:val="222222"/>
-          <w:sz w:val="22"/>
-          <w:szCs w:val="22"/>
-        </w:rPr>
-      </w:pPr>
-    </w:p>
-    <w:p>
-      <w:pPr>
-        <w:pStyle w:val="Nadpis2"/>
-        <w:spacing w:before="80" w:after="0"/>
-        <w:jc w:val="left"/>
-        <w:rPr>
-          <w:color w:val="222222"/>
-          <w:sz w:val="22"/>
-          <w:szCs w:val="22"/>
-        </w:rPr>
-      </w:pPr>
-      <w:r>
-        <w:rPr>
-          <w:b/>
-          <w:bCs/>
-          <w:color w:val="222222"/>
-          <w:sz w:val="22"/>
-          <w:szCs w:val="22"/>
-        </w:rPr>
-        <w:t>Spuštění</w:t>
-      </w:r>
-      <w:r>
-        <w:rPr>
-          <w:b/>
-          <w:bCs/>
-          <w:color w:val="222222"/>
-          <w:sz w:val="22"/>
-          <w:szCs w:val="22"/>
-        </w:rPr>
-        <w:t xml:space="preserve"> -</w:t>
-      </w:r>
-      <w:r>
-        <w:rPr>
-          <w:b/>
-          <w:bCs/>
-          <w:color w:val="222222"/>
-          <w:sz w:val="22"/>
-          <w:szCs w:val="22"/>
-          <w:lang w:val="en-US"/>
-        </w:rPr>
-        <w:t xml:space="preserve">&gt; </w:t>
-      </w:r>
-      <w:r>
-        <w:rPr>
-          <w:color w:val="222222"/>
-          <w:sz w:val="22"/>
-          <w:szCs w:val="22"/>
-        </w:rPr>
-        <w:t>příkazem z </w:t>
-      </w:r>
-      <w:proofErr w:type="spellStart"/>
-      <w:r>
-        <w:rPr>
-          <w:color w:val="222222"/>
-          <w:sz w:val="22"/>
-          <w:szCs w:val="22"/>
-        </w:rPr>
-        <w:t>rootu</w:t>
-      </w:r>
-      <w:proofErr w:type="spellEnd"/>
-      <w:r>
-        <w:rPr>
-          <w:color w:val="222222"/>
-          <w:sz w:val="22"/>
-          <w:szCs w:val="22"/>
-        </w:rPr>
-        <w:t xml:space="preserve"> projektu:</w:t>
-      </w:r>
-      <w:r>
-        <w:rPr>
-          <w:b/>
-          <w:bCs/>
-          <w:color w:val="222222"/>
-          <w:sz w:val="22"/>
-          <w:szCs w:val="22"/>
-        </w:rPr>
-        <w:t xml:space="preserve"> </w:t>
-      </w:r>
-      <w:r>
-        <w:rPr>
-          <w:b/>
-          <w:bCs/>
-          <w:color w:val="222222"/>
-          <w:sz w:val="22"/>
-          <w:szCs w:val="22"/>
-        </w:rPr>
-        <w:t xml:space="preserve">node </w:t>
-      </w:r>
-      <w:r>
-        <w:rPr>
-          <w:b/>
-          <w:bCs/>
-          <w:color w:val="222222"/>
-          <w:sz w:val="22"/>
-          <w:szCs w:val="22"/>
-        </w:rPr>
-        <w:t>./</w:t>
-      </w:r>
-      <w:proofErr w:type="spellStart"/>
-      <w:r>
-        <w:rPr>
-          <w:b/>
-          <w:bCs/>
-          <w:color w:val="222222"/>
-          <w:sz w:val="22"/>
-          <w:szCs w:val="22"/>
-        </w:rPr>
-        <w:t>tests</w:t>
-      </w:r>
-      <w:proofErr w:type="spellEnd"/>
-      <w:r>
-        <w:rPr>
-          <w:b/>
-          <w:bCs/>
-          <w:color w:val="222222"/>
-          <w:sz w:val="22"/>
-          <w:szCs w:val="22"/>
-        </w:rPr>
-        <w:t>/</w:t>
-      </w:r>
-      <w:proofErr w:type="spellStart"/>
-      <w:r>
-        <w:rPr>
-          <w:b/>
-          <w:bCs/>
-          <w:color w:val="222222"/>
-          <w:sz w:val="22"/>
-          <w:szCs w:val="22"/>
-        </w:rPr>
-        <w:t>runAllTests.test.mjs</w:t>
-      </w:r>
-      <w:proofErr w:type="spellEnd"/>
-    </w:p>
-    <w:p>
-      <w:pPr>
-        <w:pStyle w:val="Nadpis2"/>
-        <w:spacing w:before="80" w:after="0"/>
-        <w:jc w:val="left"/>
-        <w:rPr>
-          <w:color w:val="222222"/>
-          <w:sz w:val="22"/>
-          <w:szCs w:val="22"/>
-        </w:rPr>
-      </w:pPr>
-      <w:r>
-        <w:rPr>
-          <w:color w:val="222222"/>
-          <w:sz w:val="22"/>
-          <w:szCs w:val="22"/>
-        </w:rPr>
         <w:t>Výstup obsahuje počet testů, selhání a tabulku pokrytí oblastí. Aktuální stav: 10</w:t>
       </w:r>
       <w:r>
@@ -25456,7 +25179,6 @@
           <w:sz w:val="22"/>
           <w:szCs w:val="22"/>
         </w:rPr>
-        <w:lastRenderedPageBreak/>
         <w:t xml:space="preserve">Selektory a router — </w:t>
       </w:r>
       <w:r>

</xml_diff>